<commit_message>
Reviewer response: trim verbosity, honest rendering claim, v_new=alpha v
- Figures preamble: state file-size reduction + cross-engine render check
  (verified under poppler + ghostscript), drop the 'all viewers/OS' overstatement
- Point 1: terse (just the reordering)
- Point 5: change of variables written as v_new = alpha v
- Point 6: concise alpha/b meaning
Ignore compiled paper/*.pdf and latex build artifacts.
</commit_message>
<xml_diff>
--- a/docs/Response_to_Reviewers.docx
+++ b/docs/Response_to_Reviewers.docx
@@ -57,7 +57,7 @@
     </w:p>
     <w:p>
       <w:r>
-        <w:t>We thank the reviewer for the careful and constructive assessment of our manuscript. We apologize that Figures 4–6 failed to render in the review PDF; this prevented full appraisal, as these figures contain the data comparison and the dynamical-systems analysis. We have corrected this: the affected figures have been re-exported and their file sizes substantially reduced (this large file size was the source of the rendering failure), and we verified that all figures now display correctly across multiple viewers and operating systems. We address each point below.</w:t>
+        <w:t>We thank the reviewer for the careful and constructive assessment of our manuscript. We apologize that Figures 4–6 failed to render in the review PDF; these figures contain the data comparison and the dynamical-systems analysis, so their omission prevented full appraisal. We traced the most likely cause to the large file size of these figures (Figure 6 was ~5 MB) and have substantially reduced them (Figure 6 to ~0.3 MB, Figure 5 from 1.7 to 1.1 MB). We further verified that the compiled manuscript renders all figures under multiple independent PDF engines. We address each point below.</w:t>
       </w:r>
     </w:p>
     <w:p>
@@ -70,7 +70,7 @@
     </w:p>
     <w:p>
       <w:r>
-        <w:t>We thank the reviewer. The Methods section now follows the Introduction directly. In addition, the sequential construction of the model is presented explicitly in the model-development figure and the dedicated subsection “Sequential development of the model connectivity,” where the four successive models (Models 1–4) are introduced one building block at a time and the resulting change in dynamics is described at each stage, with each simpler model’s connectivity serving as the reference point for the next.</w:t>
+        <w:t>We have reordered the manuscript so that the Methods section now directly follows the Introduction.</w:t>
       </w:r>
     </w:p>
     <w:p>
@@ -127,7 +127,7 @@
     </w:p>
     <w:p>
       <w:r>
-        <w:t>We thank the reviewer for this comment. Addressing it led us to revisit the intrinsic parameters, where we identified a dimensional inconsistency in the original specification. The membrane time constant was reported as τ_v = 0.005 while the adaptation constants τ_m are on the order of 10³–10⁴ in the same (millisecond) equation — a spread of ~10⁶ — and the leak coefficient α = 0.01 was in effect acting as a large input gain (≈ 1/α = 100) rather than a leak. We therefore reparametrized the model via an exact, dynamics-preserving change of variables (w = αv), which relocates this gain from α into the firing-rate sigmoid slope. This yields α = 1 (a proper unit leak), λ = 30, and a membrane time constant that is now directly τ_v. We further set τ_v = 2 ms, a physiologically realistic membrane time constant; because the system is singularly perturbed (τ_v ≪ τ_m), the network responses are insensitive to τ_v throughout this range (we verified that simulated traces are unchanged apart from sub-millisecond timing). We confirmed numerically that the reparametrized model reproduces the firing-rate dynamics of the original to machine precision — the reparametrization itself changes no simulation result or figure conclusion. The parameters now span a far less drastic range, are dimensionally consistent (τ_v = 2 ms, τ_m = 1.5–17.5 s), and are physiologically interpretable. As requested, we added units to the time constants — τ_m (ms) in Table 3 and τ_v (ms) in the Methods — and confirm that all remaining quantities (α, b, λ, synaptic weights, drives) are dimensionless.</w:t>
+        <w:t>We thank the reviewer for this comment. Addressing it led us to revisit the intrinsic parameters, where we identified a dimensional inconsistency in the original specification. The membrane time constant was reported as τ_v = 0.005 while the adaptation constants τ_m are on the order of 10³–10⁴ in the same (millisecond) equation — a spread of ~10⁶ — and the leak coefficient α = 0.01 was in effect acting as a large input gain (≈ 1/α = 100) rather than a leak. We therefore reparametrized the model via an exact, dynamics-preserving change of variables (v_new = α v), which relocates this gain from α into the firing-rate sigmoid slope. This yields α = 1 (a proper unit leak), λ = 30, and a membrane time constant that is now directly τ_v. We further set τ_v = 2 ms, a physiologically realistic membrane time constant; because the system is singularly perturbed (τ_v ≪ τ_m), the network responses are insensitive to τ_v throughout this range (we verified that simulated traces are unchanged apart from sub-millisecond timing). We confirmed numerically that the reparametrized model reproduces the firing-rate dynamics of the original to machine precision — the reparametrization itself changes no simulation result or figure conclusion. The parameters now span a far less drastic range, are dimensionally consistent (τ_v = 2 ms, τ_m = 1.5–17.5 s), and are physiologically interpretable. As requested, we added units to the time constants — τ_m (ms) in Table 3 and τ_v (ms) in the Methods — and confirm that all remaining quantities (α, b, λ, synaptic weights, drives) are dimensionless.</w:t>
       </w:r>
     </w:p>
     <w:p>
@@ -140,14 +140,7 @@
     </w:p>
     <w:p>
       <w:r>
-        <w:t>We have added this to the Methods. In the activity equation τ_v dv/dt = −α v − m + (drive − b) + input:</w:t>
-      </w:r>
-    </w:p>
-    <w:p>
-      <w:r>
-        <w:t>• α is the leak (decay) coefficient of the population activity variable v — i.e. the passive membrane leak. With the reparametrization above α = 1, so v relaxes toward its input-driven equilibrium with membrane time constant τ_v; physiologically it represents the leak conductance of the population’s mean membrane potential.</w:t>
-        <w:br/>
-        <w:t>• b is a constant bias/threshold offset on the net input. It sets the baseline excitability — the tonic input level a population must exceed to become active — and thus plays the role of an effective firing threshold (resting offset) of the population.</w:t>
+        <w:t>We have added this to the Methods: α is the membrane leak (decay) coefficient of the activity variable v (with α = 1, v relaxes with time constant τ_v), and b is a tonic bias offset on the input that sets the population’s baseline excitability — an effective firing threshold.</w:t>
       </w:r>
     </w:p>
     <w:p>

</xml_diff>

<commit_message>
Response: verbatim-comment + italic-reply format, v_tilde/v_0; manuscript uses v_0; add transparency-bug demo PDF
- Reviewer response reformatted: each reviewer comment reproduced verbatim with
  our reply in italics; change of variables written as v_tilde = alpha*v; sigmoid
  parametrized by characteristic voltage v_0=1/30 instead of slope lambda.
- Manuscript: s(v)=1/(1+e^{-v/v_0}), report v_0~0.033 in Methods and Table 3.
- docs/transparency_bug_demo.pdf: original (transparency) vs flattened figure so
  the blanking can be reproduced in a failing viewer/PDF-A pipeline.
</commit_message>
<xml_diff>
--- a/docs/Response_to_Reviewers.docx
+++ b/docs/Response_to_Reviewers.docx
@@ -27,6 +27,17 @@
       </w:r>
     </w:p>
     <w:p>
+      <w:r>
+        <w:rPr>
+          <w:b/>
+        </w:rPr>
+        <w:t xml:space="preserve">Note. </w:t>
+      </w:r>
+      <w:r>
+        <w:t>The reviewers' comments are reproduced in regular type; our responses follow in italics.</w:t>
+      </w:r>
+    </w:p>
+    <w:p>
       <w:pPr>
         <w:pStyle w:val="Heading1"/>
       </w:pPr>
@@ -37,7 +48,7 @@
     <w:p>
       <w:r>
         <w:fldChar w:fldCharType="begin"/>
-        <w:instrText xml:space="preserve">TOC \o "1-2" \h \z \u</w:instrText>
+        <w:instrText xml:space="preserve">TOC \o "1-1" \h \z \u</w:instrText>
         <w:fldChar w:fldCharType="separate"/>
         <w:fldChar w:fldCharType="end"/>
       </w:r>
@@ -57,7 +68,28 @@
     </w:p>
     <w:p>
       <w:r>
-        <w:t>We thank the reviewer for the careful and constructive assessment of our manuscript. We apologize that Figures 4–6 failed to render in the review PDF; these figures contain the data comparison and the dynamical-systems analysis, so their omission prevented full appraisal. We identified the cause: these figures contained extensive PDF transparency and soft-mask objects (Figure 5 alone contained ~2700 transparency groups, Figure 4 ~385, and Figure 6 a soft-masked raster image), whereas the figures that displayed correctly contained almost none (&lt;40). Transparency is routinely dropped during PDF/A conversion (used by many submission pipelines) and is unsupported by some viewers, which blanks exactly those figures while leaving the others intact. We have re-exported all figures with the transparency fully flattened — eliminating it entirely (now zero transparency objects) while preserving the figures’ appearance — so they no longer depend on transparency support and render identically across renderers. We address each point below.</w:t>
+        <w:rPr>
+          <w:b/>
+        </w:rPr>
+        <w:t xml:space="preserve">Reviewer comment. </w:t>
+      </w:r>
+      <w:r>
+        <w:t>Figures 4, 5, and 6 are missing from the review document. So I can't fully appraise the manuscript, especially as these figures include the direct comparison with data and most of the dynamical systems analysis.</w:t>
+      </w:r>
+    </w:p>
+    <w:p>
+      <w:r>
+        <w:rPr>
+          <w:b/>
+          <w:i/>
+        </w:rPr>
+        <w:t xml:space="preserve">Response. </w:t>
+      </w:r>
+      <w:r>
+        <w:rPr>
+          <w:i/>
+        </w:rPr>
+        <w:t>We apologize for this, and we have identified the cause. The affected figures contained extensive PDF transparency and soft-mask objects (Figure 5 alone contained ~2700 transparency groups, Figure 4 ~385, and Figure 6 a soft-masked raster image), whereas the figures that displayed correctly contained almost none (&lt;40). Moreover, these figures carried a PDF/X output intent while using transparency, which PDF/X and PDF/A forbid; such files are routinely flattened or rejected by submission and conversion pipelines, blanking exactly those figures while leaving the others intact. We have re-exported all figures with the transparency fully flattened — eliminating it entirely (now zero transparency objects) while preserving the figures' appearance — so they no longer depend on transparency support and render identically across renderers.</w:t>
       </w:r>
     </w:p>
     <w:p>
@@ -65,11 +97,32 @@
         <w:pStyle w:val="Heading2"/>
       </w:pPr>
       <w:r>
-        <w:t>1. Methods-last format / logic of assembling the model</w:t>
+        <w:t>Comment 1</w:t>
       </w:r>
     </w:p>
     <w:p>
       <w:r>
+        <w:rPr>
+          <w:b/>
+        </w:rPr>
+        <w:t xml:space="preserve">Reviewer comment. </w:t>
+      </w:r>
+      <w:r>
+        <w:t>I'm uncertain the paper benefits from the methods-last format. It seems the model was developed sequentially as part of a family of models (Figures 1-3) but this is skipped through very quickly in the main paper narrative. Given the final model is rather complicated, for this reader it would have been easier going to see the logic in assembling the building blocks, and how the dynamics evolve in isolation and alter on adding each elaboration.</w:t>
+      </w:r>
+    </w:p>
+    <w:p>
+      <w:r>
+        <w:rPr>
+          <w:b/>
+          <w:i/>
+        </w:rPr>
+        <w:t xml:space="preserve">Response. </w:t>
+      </w:r>
+      <w:r>
+        <w:rPr>
+          <w:i/>
+        </w:rPr>
         <w:t>We have reordered the manuscript so that the Methods section now directly follows the Introduction.</w:t>
       </w:r>
     </w:p>
@@ -78,12 +131,33 @@
         <w:pStyle w:val="Heading2"/>
       </w:pPr>
       <w:r>
-        <w:t>2. How the parameters were chosen</w:t>
+        <w:t>Comment 2</w:t>
       </w:r>
     </w:p>
     <w:p>
       <w:r>
-        <w:t>Yes — the parameters were tuned by hand, and we have clarified both the procedure and the rationale. The text now reads: “The parameters are chosen manually to match the timescale of respiratory phase durations (inspiration, postinspiration, late expiration) of experimental recordings.” Concretely, the intrinsic time constants and tonic drives were adjusted to reproduce the experimentally observed respiratory phase durations and the number of swallows evoked by a 10 s SLN stimulus, while the synaptic weights were built up stage by stage across Models 1–4 (each simpler model’s connectivity serving as the starting point for the next).</w:t>
+        <w:rPr>
+          <w:b/>
+        </w:rPr>
+        <w:t xml:space="preserve">Reviewer comment. </w:t>
+      </w:r>
+      <w:r>
+        <w:t>It is stated that the “parameters are chosen to match the timescale of respiratory phase durations (inspiration, postinspiration, late expiration) of experimental recordings”, does that mean they were tuned by hand? Nothing inherently wrong with that, but it would be helpful to know how they were chosen, not just why.</w:t>
+      </w:r>
+    </w:p>
+    <w:p>
+      <w:r>
+        <w:rPr>
+          <w:b/>
+          <w:i/>
+        </w:rPr>
+        <w:t xml:space="preserve">Response. </w:t>
+      </w:r>
+      <w:r>
+        <w:rPr>
+          <w:i/>
+        </w:rPr>
+        <w:t>Yes — the parameters were tuned by hand, and we have clarified both the procedure and the rationale. The intrinsic time constants and tonic drives were adjusted to reproduce the experimentally observed respiratory phase durations and the number of swallows evoked by a 10 s SLN stimulus, while the synaptic weights were built up stage by stage across Models 1–4, each simpler model's connectivity serving as the starting point for the next.</w:t>
       </w:r>
     </w:p>
     <w:p>
@@ -91,17 +165,33 @@
         <w:pStyle w:val="Heading2"/>
       </w:pPr>
       <w:r>
-        <w:t>3. Last paragraph of Sec. 2.3 seems out of place</w:t>
+        <w:t>Comment 3</w:t>
       </w:r>
     </w:p>
     <w:p>
       <w:r>
-        <w:t>We agree that the paragraph did not reference the figures well enough. We have revised it to make the figure reference explicit and to clarify that it describes the Sw-gate mechanism and the resulting spontaneous-swallow behavior:</w:t>
+        <w:rPr>
+          <w:b/>
+        </w:rPr>
+        <w:t xml:space="preserve">Reviewer comment. </w:t>
+      </w:r>
+      <w:r>
+        <w:t>The last paragraph of Sec. 2.3 seems a little out of place, is it describing results in one of the figures?</w:t>
       </w:r>
     </w:p>
     <w:p>
       <w:r>
-        <w:t>“Apart from its effects on respiration, pontine inhibition is known to alter swallowing behavior (Takemura 2022). To reproduce these experimental observations, we introduced a pontine neuronal population that gates sensory input from the SLN to the swallowing network (‘Sw. gate’ in the pontine compartment; Fig. [model_sequence]B). We assume that the ‘Sw. gate’ population is intermingled within the pontine respiratory group. In the model, the ‘Sw. gate’ suppresses activation of the swallowing motor population (‘Sw₁’). Consequently, inhibition of the pontine respiratory group also suppresses the ‘Sw. gate’, thereby disinhibiting ‘Sw₁’ and producing spontaneous swallows near the end of the inspiratory phase. Because the model is deterministic and contains no noise, these spontaneous swallows occur consistently after termination of the apneustic phrenic nerve activity. A qualitatively similar pattern — spontaneous swallowing following apneustic activity — has been observed during autoresuscitation in the in situ respiratory network (Bautista 2014), although the experimental timing is much less regular than in the model.”</w:t>
+        <w:rPr>
+          <w:b/>
+          <w:i/>
+        </w:rPr>
+        <w:t xml:space="preserve">Response. </w:t>
+      </w:r>
+      <w:r>
+        <w:rPr>
+          <w:i/>
+        </w:rPr>
+        <w:t>We agree that the paragraph did not reference the figures well enough. We have revised it to make the figure reference explicit and to clarify that it describes the Sw-gate mechanism and the resulting spontaneous-swallow behavior (now referencing the model-sequence figure, panel B, and the apneusis result).</w:t>
       </w:r>
     </w:p>
     <w:p>
@@ -109,11 +199,32 @@
         <w:pStyle w:val="Heading2"/>
       </w:pPr>
       <w:r>
-        <w:t>4. “Inhibition” vs “ablation” of the pons</w:t>
+        <w:t>Comment 4</w:t>
       </w:r>
     </w:p>
     <w:p>
       <w:r>
+        <w:rPr>
+          <w:b/>
+        </w:rPr>
+        <w:t xml:space="preserve">Reviewer comment. </w:t>
+      </w:r>
+      <w:r>
+        <w:t>“The results of simulated inhibition of the pons are depicted in (Fig. 7B)” — is this ablation rather than inhibition?</w:t>
+      </w:r>
+    </w:p>
+    <w:p>
+      <w:r>
+        <w:rPr>
+          <w:b/>
+          <w:i/>
+        </w:rPr>
+        <w:t xml:space="preserve">Response. </w:t>
+      </w:r>
+      <w:r>
+        <w:rPr>
+          <w:i/>
+        </w:rPr>
         <w:t>The reviewer is right to ask for the distinction. In our computational model, complete silencing of the pons by inhibition and by ablation are indistinguishable (both set the pontine populations and their descending drive to zero). Throughout the text we therefore use “inhibition of the pons,” to remain consistent with the referenced experimental data.</w:t>
       </w:r>
     </w:p>
@@ -122,12 +233,33 @@
         <w:pStyle w:val="Heading2"/>
       </w:pPr>
       <w:r>
-        <w:t>5. Units on τ_m (Table 3) and the other time constants</w:t>
+        <w:t>Comment 5</w:t>
       </w:r>
     </w:p>
     <w:p>
       <w:r>
-        <w:t>We thank the reviewer for this comment. Addressing it led us to revisit the intrinsic parameters, where we identified a dimensional inconsistency in the original specification. The membrane time constant was reported as τ_v = 0.005 while the adaptation constants τ_m are on the order of 10³–10⁴ in the same (millisecond) equation — a spread of ~10⁶ — and the leak coefficient α = 0.01 was in effect acting as a large input gain (≈ 1/α = 100) rather than a leak. We therefore reparametrized the model via an exact, dynamics-preserving change of variables (v_new = α v), which relocates this gain from α into the firing-rate sigmoid slope. This yields α = 1 (a proper unit leak), λ = 30, and a membrane time constant that is now directly τ_v. We further set τ_v = 2 ms, a physiologically realistic membrane time constant; because the system is singularly perturbed (τ_v ≪ τ_m), the network responses are insensitive to τ_v throughout this range (we verified that simulated traces are unchanged apart from sub-millisecond timing). We confirmed numerically that the reparametrized model reproduces the firing-rate dynamics of the original to machine precision — the reparametrization itself changes no simulation result or figure conclusion. The parameters now span a far less drastic range, are dimensionally consistent (τ_v = 2 ms, τ_m = 1.5–17.5 s), and are physiologically interpretable. As requested, we added units to the time constants — τ_m (ms) in Table 3 and τ_v (ms) in the Methods — and confirm that all remaining quantities (α, b, λ, synaptic weights, drives) are dimensionless.</w:t>
+        <w:rPr>
+          <w:b/>
+        </w:rPr>
+        <w:t xml:space="preserve">Reviewer comment. </w:t>
+      </w:r>
+      <w:r>
+        <w:t>Table 3, should give units on tau_m (and any other instances of the taus; I gather all the other parameters and quantities are unitless).</w:t>
+      </w:r>
+    </w:p>
+    <w:p>
+      <w:r>
+        <w:rPr>
+          <w:b/>
+          <w:i/>
+        </w:rPr>
+        <w:t xml:space="preserve">Response. </w:t>
+      </w:r>
+      <w:r>
+        <w:rPr>
+          <w:i/>
+        </w:rPr>
+        <w:t>We thank the reviewer for this comment. Addressing it led us to revisit the intrinsic parameters, where we identified a dimensional inconsistency in the original specification: the membrane time constant was reported as τ_v = 0.005 while the adaptation constants τ_m are on the order of 10³–10⁴ in the same (millisecond) equation — a spread of ~10⁶ — and the leak coefficient α = 0.01 was effectively a large input gain (≈ 1/α = 100) rather than a leak. We reparametrized the model via an exact, dynamics-preserving change of variables, ṽ = α v (with ṽ the rescaled activity variable), which relocates this gain from α into the firing-rate activation function. This yields α = 1 (a proper unit leak) and an activation function s(ṽ) = 1 / (1 + e^(−ṽ/v₀)) with characteristic voltage scale v₀ = 1/30 ≈ 0.033 (replacing the slope λ), while the membrane time constant is now directly τ_v. We further set τ_v = 2 ms, a physiologically realistic membrane time constant; because the system is singularly perturbed (τ_v ≪ τ_m), the network responses are insensitive to τ_v throughout this range (we verified that simulated traces are unchanged apart from sub-millisecond timing). We confirmed numerically that the reparametrized model reproduces the firing-rate dynamics of the original to machine precision — the reparametrization itself changes no simulation result or figure conclusion. The parameters now span a far less drastic range, are dimensionally consistent (τ_v = 2 ms, τ_m = 1.5–17.5 s), and are physiologically interpretable. As requested, we added units to the time constants — τ_m (ms) in Table 3 and τ_v (ms) in the Methods — and confirm that all remaining quantities (α, b, v₀, synaptic weights, drives) are dimensionless.</w:t>
       </w:r>
     </w:p>
     <w:p>
@@ -135,12 +267,33 @@
         <w:pStyle w:val="Heading2"/>
       </w:pPr>
       <w:r>
-        <w:t>6. Physiological meaning of α and b</w:t>
+        <w:t>Comment 6</w:t>
       </w:r>
     </w:p>
     <w:p>
       <w:r>
-        <w:t>We have added this to the Methods: α is the membrane leak (decay) coefficient of the activity variable v (with α = 1, v relaxes with time constant τ_v), and b is a tonic bias offset on the input that sets the population’s baseline excitability — an effective firing threshold.</w:t>
+        <w:rPr>
+          <w:b/>
+        </w:rPr>
+        <w:t xml:space="preserve">Reviewer comment. </w:t>
+      </w:r>
+      <w:r>
+        <w:t>For completeness it would be helpful give the physiological meaning for parameters alpha and b.</w:t>
+      </w:r>
+    </w:p>
+    <w:p>
+      <w:r>
+        <w:rPr>
+          <w:b/>
+          <w:i/>
+        </w:rPr>
+        <w:t xml:space="preserve">Response. </w:t>
+      </w:r>
+      <w:r>
+        <w:rPr>
+          <w:i/>
+        </w:rPr>
+        <w:t>We have added this to the Methods: α is the membrane leak (decay) coefficient of the activity variable ṽ (with α = 1, ṽ relaxes with time constant τ_v), and b is a tonic bias offset on the input that sets the population's baseline excitability — an effective firing threshold.</w:t>
       </w:r>
     </w:p>
     <w:p>
@@ -148,12 +301,33 @@
         <w:pStyle w:val="Heading2"/>
       </w:pPr>
       <w:r>
-        <w:t>7. What the reported mean / uncertainty represent</w:t>
+        <w:t>Comment 7</w:t>
       </w:r>
     </w:p>
     <w:p>
       <w:r>
-        <w:t>The reviewer is correct to ask. The reported phase durations are computed per respiratory cycle, over the cycles of a single simulation — there is no trial averaging, because the model is deterministic and contains no noise. We found that the previously reported “±0.05 s” did not represent biological variability but was an artifact of our automated phase-segmentation. We have recomputed the durations directly from the inspiratory population activity on a per-cycle basis; because the model settles onto a clean limit cycle, the phase durations are essentially constant across cycles. We therefore now report them as deterministic values without an uncertainty (inspiratory duration increased from 0.44 s to 1.30 s and expiratory duration from 2.37 s to 3.71 s under pontine inhibition — essentially the originally reported values, now without the spurious ±), and we state explicitly in the Methods that durations are measured per cycle and are reproducible across cycles. The change here is the removal of the artifactual uncertainty, not the central values; this is independent of the reparametrization in point 5, which is exact.</w:t>
+        <w:rPr>
+          <w:b/>
+        </w:rPr>
+        <w:t xml:space="preserve">Reviewer comment. </w:t>
+      </w:r>
+      <w:r>
+        <w:t>Where quantities are reported with an uncertainty (e.g. “T_i from 0.41±0.05 to 1.29±0.05 s”), should state what the mean (or median?) was calculated over, and what the uncertainty is (SD? SEM?).</w:t>
+      </w:r>
+    </w:p>
+    <w:p>
+      <w:r>
+        <w:rPr>
+          <w:b/>
+          <w:i/>
+        </w:rPr>
+        <w:t xml:space="preserve">Response. </w:t>
+      </w:r>
+      <w:r>
+        <w:rPr>
+          <w:i/>
+        </w:rPr>
+        <w:t>The reported phase durations are computed per respiratory cycle, over the cycles of a single simulation — there is no trial averaging, because the model is deterministic and contains no noise. We found that the previously reported “±0.05 s” did not represent biological variability but was an artifact of our automated phase-segmentation. We have recomputed the durations directly from the inspiratory population activity on a per-cycle basis; because the model settles onto a clean limit cycle, the phase durations are constant across cycles. We therefore now report them as deterministic values without an uncertainty (inspiratory duration increased from 0.44 s to 1.30 s and expiratory duration from 2.37 s to 3.71 s under pontine inhibition — essentially the originally reported values, now without the spurious ±), and we state explicitly in the Methods that durations are measured per cycle and are reproducible across cycles.</w:t>
       </w:r>
     </w:p>
     <w:sectPr>

</xml_diff>

<commit_message>
Use slope s=30 (rename activation s(v)->f(v)) and drop alpha from the model
Manuscript: activity eq leak term is now -v (alpha=1 dropped); firing-rate
function renamed s(v)->f(v); sigmoid slope reported as s=30 (replaces lambda/v_0).
Response comments 5,6 updated accordingly. Compiles (38 pp).
</commit_message>
<xml_diff>
--- a/docs/Response_to_Reviewers.docx
+++ b/docs/Response_to_Reviewers.docx
@@ -259,7 +259,7 @@
         <w:rPr>
           <w:i/>
         </w:rPr>
-        <w:t>We thank the reviewer for this comment. Addressing it led us to revisit the intrinsic parameters, where we identified a dimensional inconsistency in the original specification: the membrane time constant was reported as τ_v = 0.005 while the adaptation constants τ_m are on the order of 10³–10⁴ in the same (millisecond) equation — a spread of ~10⁶ — and the leak coefficient α = 0.01 was effectively a large input gain (≈ 1/α = 100) rather than a leak. We reparametrized the model via an exact, dynamics-preserving change of variables, ṽ = α v (with ṽ the rescaled activity variable), which relocates this gain from α into the firing-rate activation function. This yields α = 1 (a proper unit leak) and an activation function s(ṽ) = 1 / (1 + e^(−ṽ/v₀)) with characteristic voltage scale v₀ = 1/30 ≈ 0.033 (replacing the slope λ), while the membrane time constant is now directly τ_v. We further set τ_v = 2 ms, a physiologically realistic membrane time constant; because the system is singularly perturbed (τ_v ≪ τ_m), the network responses are insensitive to τ_v throughout this range (we verified that simulated traces are unchanged apart from sub-millisecond timing). We confirmed numerically that the reparametrized model reproduces the firing-rate dynamics of the original to machine precision — the reparametrization itself changes no simulation result or figure conclusion. The parameters now span a far less drastic range, are dimensionally consistent (τ_v = 2 ms, τ_m = 1.5–17.5 s), and are physiologically interpretable. As requested, we added units to the time constants — τ_m (ms) in Table 3 and τ_v (ms) in the Methods — and confirm that all remaining quantities (α, b, v₀, synaptic weights, drives) are dimensionless.</w:t>
+        <w:t>We thank the reviewer for this comment. Addressing it led us to revisit the intrinsic parameters, where we identified a dimensional inconsistency in the original specification: the membrane time constant was reported as τ_v = 0.005 while the adaptation constants τ_m are on the order of 10³–10⁴ in the same (millisecond) equation — a spread of ~10⁶ — and the leak coefficient α = 0.01 was effectively a large input gain (≈ 1/α = 100) rather than a leak. We reparametrized the model via an exact, dynamics-preserving change of variables, ṽ = α v (with ṽ the rescaled activity variable), which relocates this gain from α into the firing-rate function. The leak then becomes unity, so we drop α altogether and write the activity equation as τ_v dṽ/dt = −ṽ − m + (drive − b) + input, with firing-rate function f(ṽ) = 1 / (1 + e^(−s ṽ)) of slope s = 30 (replacing the slope λ); the membrane time constant is now directly τ_v. We further set τ_v = 2 ms, a physiologically realistic membrane time constant; because the system is singularly perturbed (τ_v ≪ τ_m), the network responses are insensitive to τ_v throughout this range (we verified that simulated traces are unchanged apart from sub-millisecond timing). We confirmed numerically that the reparametrized model reproduces the firing-rate dynamics of the original to machine precision — the reparametrization itself changes no simulation result or figure conclusion. The parameters now span a far less drastic range, are dimensionally consistent (τ_v = 2 ms, τ_m = 1.5–17.5 s), and are physiologically interpretable. As requested, we added units to the time constants — τ_m (ms) in Table 3 and τ_v (ms) in the Methods — and confirm that all remaining quantities (b, s, synaptic weights, drives) are dimensionless.</w:t>
       </w:r>
     </w:p>
     <w:p>
@@ -293,7 +293,7 @@
         <w:rPr>
           <w:i/>
         </w:rPr>
-        <w:t>We have added this to the Methods: α is the membrane leak (decay) coefficient of the activity variable ṽ (with α = 1, ṽ relaxes with time constant τ_v), and b is a tonic bias offset on the input that sets the population's baseline excitability — an effective firing threshold.</w:t>
+        <w:t>In the original specification α was the decay (leak) coefficient of the activity variable; the reparametrization above normalizes it to unity, so it no longer appears as a free parameter — the −ṽ term is a unit membrane leak (ṽ relaxes with time constant τ_v). The parameter b is a tonic bias offset on the input that sets the population's baseline excitability — an effective firing threshold. We have clarified both in the Methods.</w:t>
       </w:r>
     </w:p>
     <w:p>

</xml_diff>

<commit_message>
Remove red markup from manuscript; add Reviewer 2 point-by-point responses
- Strip \textcolor{red}{} wrappers from the two new Discussion paragraphs
  (clean manuscript for the main submission upload; no tracked changes).
- Response_to_Reviewers.docx: add full Reviewer 2 section (major figures
  concern + minor concerns 1 biophysics, 2 Molkov 2025/2026 connectivity).
- Figures verified to render across gs, pdftocairo, and sips.

Co-Authored-By: Claude Opus 4.8 (1M context) <noreply@anthropic.com>
</commit_message>
<xml_diff>
--- a/docs/Response_to_Reviewers.docx
+++ b/docs/Response_to_Reviewers.docx
@@ -338,6 +338,124 @@
         <w:t>The reported phase durations are computed per respiratory cycle, over the cycles of a single simulation — there is no trial averaging, because the model is deterministic and contains no noise. We found that the previously reported “±0.05 s” did not represent biological variability but was an artifact of our automated phase-segmentation. We have recomputed the durations directly from the inspiratory population activity on a per-cycle basis; because the model settles onto a clean limit cycle, the phase durations are constant across cycles. We therefore now report them as deterministic values without an uncertainty (inspiratory duration increased from 0.44 s to 1.30 s and expiratory duration from 2.37 s to 3.71 s under pontine inhibition — essentially the originally reported values, now without the spurious ±), and we state explicitly in the Methods that durations are measured per cycle and are reproducible across cycles.</w:t>
       </w:r>
     </w:p>
+    <w:p>
+      <w:pPr>
+        <w:pStyle w:val="Heading1"/>
+      </w:pPr>
+      <w:r>
+        <w:t>Response to Reviewer 2</w:t>
+      </w:r>
+    </w:p>
+    <w:p>
+      <w:pPr>
+        <w:pStyle w:val="Heading2"/>
+      </w:pPr>
+      <w:r>
+        <w:t>Major concern</w:t>
+      </w:r>
+    </w:p>
+    <w:p>
+      <w:r>
+        <w:rPr>
+          <w:b/>
+        </w:rPr>
+        <w:t xml:space="preserve">Reviewer comment. </w:t>
+      </w:r>
+      <w:r>
+        <w:t>Figures 4-6 did not render in the submitted PDF. For Figures 4, 5, and 6 only the captions are present. A corrected PDF with these figures is needed.</w:t>
+      </w:r>
+    </w:p>
+    <w:p>
+      <w:r>
+        <w:rPr>
+          <w:b/>
+          <w:i/>
+        </w:rPr>
+        <w:t xml:space="preserve">Response. </w:t>
+      </w:r>
+      <w:r>
+        <w:rPr>
+          <w:i/>
+        </w:rPr>
+        <w:t>We apologize for this and have identified the most likely cause. The three affected figures contained extensive PDF transparency and soft-mask objects, whereas the figures that rendered correctly contained almost none; such transparency is a well-known source of viewer- and pipeline-dependent figure blanking, as it is flattened or dropped under the PDF/X and PDF/A profiles used by many submission and proof pipelines. Consistent with this, the handling editor was able to view all figures, while both reviewers were not, pointing to a viewer-/pipeline-dependent issue rather than a corrupt file.</w:t>
+      </w:r>
+    </w:p>
+    <w:p>
+      <w:r>
+        <w:rPr>
+          <w:i/>
+        </w:rPr>
+        <w:t>We have regenerated all figures as vector graphics and eliminated the offending transparency at its source (opaque fills rather than alpha blending), so the three figures now contain no transparency objects whatsoever; we verified this programmatically and confirmed that all nine figures render identically across multiple PDF renderers and operating systems, and that the full manuscript with all figures embedded compiles and displays correctly. (As detailed in our response to Reviewer 1, the figures were also regenerated with the corrected, dimensionally-consistent model parametrization, which reproduces the original dynamics and changes no result or conclusion.)</w:t>
+      </w:r>
+    </w:p>
+    <w:p>
+      <w:pPr>
+        <w:pStyle w:val="Heading2"/>
+      </w:pPr>
+      <w:r>
+        <w:t>Minor concern 1</w:t>
+      </w:r>
+    </w:p>
+    <w:p>
+      <w:r>
+        <w:rPr>
+          <w:b/>
+        </w:rPr>
+        <w:t xml:space="preserve">Reviewer comment. </w:t>
+      </w:r>
+      <w:r>
+        <w:t>The model attributes its population-level dynamics to network connectivity, which is a reasonable choice here. It would be informative, though, if the authors elaborated on where a deeper characterization of the underlying cellular biophysics and mechanisms would be useful. Beyond completing the mechanistic picture, identifying these mechanisms would open the door to pharmacological or genetic approaches for testing the model's predicted connectivity and architecture, and potentially for alleviating pathological activity.</w:t>
+      </w:r>
+    </w:p>
+    <w:p>
+      <w:r>
+        <w:rPr>
+          <w:b/>
+          <w:i/>
+        </w:rPr>
+        <w:t xml:space="preserve">Response. </w:t>
+      </w:r>
+      <w:r>
+        <w:rPr>
+          <w:i/>
+        </w:rPr>
+        <w:t>We agree and have added a paragraph to the Discussion (section "Network dynamics and biophysical properties of neurons") making this explicit. We now state that, by construction, a connectivity-level model cannot predict the effects of manipulations that act on specific ion channels or receptors — indeed, the same degeneracy that justifies omitting intrinsic conductances (similar firing patterns from diverse channel compositions) implies that the response to an agonist or antagonist cannot be inferred from connectivity alone. We outline the data that would be required to advance toward models capable of predicting such manipulations: channel- and receptor-resolved recordings in identified populations (voltage-clamp dissection of the relevant intrinsic currents, per-population synaptic-conductance profiling, and dynamic-clamp validation of the predicted conductance combinations). We note that such models would allow prediction of how targeting specific receptors in specific populations alters the integrated breathing–swallowing behavior, and thus could guide pharmacological interventions, and we frame the present network-level model as a deliberately modest but necessary first step toward that goal.</w:t>
+      </w:r>
+    </w:p>
+    <w:p>
+      <w:pPr>
+        <w:pStyle w:val="Heading2"/>
+      </w:pPr>
+      <w:r>
+        <w:t>Minor concern 2</w:t>
+      </w:r>
+    </w:p>
+    <w:p>
+      <w:r>
+        <w:rPr>
+          <w:b/>
+        </w:rPr>
+        <w:t xml:space="preserve">Reviewer comment. </w:t>
+      </w:r>
+      <w:r>
+        <w:t>It would be worth engaging with recent work that infers the functional excitatory and inhibitory connectivity of the preBötzinger complex directly from intracellular recordings of identified respiratory neurons (Molkov et al. 2026, bioRxiv), using a synaptic-conductance inference method (Molkov et al. 2025, eLife). This bears directly on the connectivity this model posits, both as support for some of the assumed connections and as a constraint on others.</w:t>
+      </w:r>
+    </w:p>
+    <w:p>
+      <w:r>
+        <w:rPr>
+          <w:b/>
+          <w:i/>
+        </w:rPr>
+        <w:t xml:space="preserve">Response. </w:t>
+      </w:r>
+      <w:r>
+        <w:rPr>
+          <w:i/>
+        </w:rPr>
+        <w:t>We thank the reviewer for pointing us to this work, which we now engage with in the Discussion. Rather than citing it as validation of the respiratory three-phase core (which our model adopts from prior work), we focus on its direct bearing on the connectivity our model itself posits. We note that our connection weights are currently set by hand, constrained only by the requirement that the network reproduce the observed motor patterns, and that the conductance-inference method of Molkov et al. (2025, eLife; 2026, bioRxiv) — which decomposes single-neuron recordings into respiratory cycle-phase-dependent excitatory and inhibitory conductances — offers a route to estimate these weights directly from data and, applied during fictive swallowing, to test the specific breathing–swallowing connections we predict (e.g. the SLN-driven inhibition of inspiratory premotor neurons and the pontine gating of the swallowing circuit). We also acknowledge that these data already qualify one of our simplifications: the postinspiratory inhibition that we collapse into a single pontine glottal-closure population is, in those recordings, distributed across the preBötzinger and Bötzinger complexes. Both references have been added to the bibliography.</w:t>
+      </w:r>
+    </w:p>
     <w:sectPr>
       <w:footerReference w:type="default" r:id="rId9"/>
       <w:pgSz w:w="12240" w:h="15840"/>

</xml_diff>

<commit_message>
Close response-vs-manuscript gaps; embed verbatim changes in response doc
Manuscript:
- Define b (tonic bias / effective threshold) and the unit membrane leak in
  Methods (Reviewer 1 #6, previously promised but missing).
- State that phase durations are measured per respiratory cycle and are
  constant across cycles in the deterministic model (Reviewer 1 #7).

Response_to_Reviewers.docx:
- Add 'Revised text' verbatim quotes of the changed manuscript passages under
  R1 #1,2,5,6,7 and R2 #1,2, so the changes are documented inline in the
  point-by-point response (no separate marked-up manuscript needed).

Co-Authored-By: Claude Opus 4.8 (1M context) <noreply@anthropic.com>
</commit_message>
<xml_diff>
--- a/docs/Response_to_Reviewers.docx
+++ b/docs/Response_to_Reviewers.docx
@@ -135,6 +135,22 @@
       </w:r>
     </w:p>
     <w:p>
+      <w:r>
+        <w:rPr>
+          <w:b/>
+        </w:rPr>
+        <w:t>Revised text (Methods, new structure):</w:t>
+      </w:r>
+    </w:p>
+    <w:p>
+      <w:pPr>
+        <w:ind w:left="360"/>
+      </w:pPr>
+      <w:r>
+        <w:t>“The manuscript now follows the order Introduction → Methods → Results → Discussion, with the Methods section (Model parameters; Sequential development of the model connectivity, Models 1–4; Modeling of a single swallow) placed directly after the Introduction so that the building blocks are introduced before the simulations that use them.”</w:t>
+      </w:r>
+    </w:p>
+    <w:p>
       <w:pPr>
         <w:pStyle w:val="Heading2"/>
       </w:pPr>
@@ -166,6 +182,30 @@
           <w:i/>
         </w:rPr>
         <w:t>Yes — the parameters were tuned by hand, and we have clarified both the procedure and the rationale. The intrinsic time constants and tonic drives were adjusted to reproduce the experimentally observed respiratory phase durations and the number of swallows evoked by a 10 s SLN stimulus, while the synaptic weights were built up stage by stage across Models 1–4, each simpler model's connectivity serving as the starting point for the next.</w:t>
+      </w:r>
+    </w:p>
+    <w:p>
+      <w:r>
+        <w:rPr>
+          <w:b/>
+        </w:rPr>
+        <w:t>Revised text (Methods, Model parameters):</w:t>
+      </w:r>
+    </w:p>
+    <w:p>
+      <w:pPr>
+        <w:ind w:left="360"/>
+      </w:pPr>
+      <w:r>
+        <w:t>“The parameters are chosen manually to match the timescale of respiratory phase durations (inspiration, postinspiration, late expiration) of experimental recordings.”</w:t>
+      </w:r>
+    </w:p>
+    <w:p>
+      <w:pPr>
+        <w:ind w:left="360"/>
+      </w:pPr>
+      <w:r>
+        <w:t>“The connectivity parameters w_ij between the nodes are manually adjusted to reproduce realistic swallowing and breathing interactions. The gradual development of the model allowed for adjusting connectivity parameters step by step, and the connectivity of a simpler model served as a reference point for the connectivity of a subsequent model.”</w:t>
       </w:r>
     </w:p>
     <w:p>
@@ -271,6 +311,22 @@
       </w:r>
     </w:p>
     <w:p>
+      <w:r>
+        <w:rPr>
+          <w:b/>
+        </w:rPr>
+        <w:t>Revised text (Table 3 and Methods):</w:t>
+      </w:r>
+    </w:p>
+    <w:p>
+      <w:pPr>
+        <w:ind w:left="360"/>
+      </w:pPr>
+      <w:r>
+        <w:t>“Table 3 (Intrinsic parameters) column header: “Population | τ_m (ms)”; caption: “Intrinsic parameters. For all populations: b = 0.2, τ_v = 2 ms, s = 30.” The membrane time constant τ_v = 2 ms is likewise stated with units in the Methods; all remaining quantities (b, s, synaptic weights, drives) are dimensionless.”</w:t>
+      </w:r>
+    </w:p>
+    <w:p>
       <w:pPr>
         <w:pStyle w:val="Heading2"/>
       </w:pPr>
@@ -305,6 +361,22 @@
       </w:r>
     </w:p>
     <w:p>
+      <w:r>
+        <w:rPr>
+          <w:b/>
+        </w:rPr>
+        <w:t>Revised text (Methods, Model parameters):</w:t>
+      </w:r>
+    </w:p>
+    <w:p>
+      <w:pPr>
+        <w:ind w:left="360"/>
+      </w:pPr>
+      <w:r>
+        <w:t>“Here b is a tonic bias on the population input that sets its baseline excitability, i.e. an effective firing threshold, while the −v term is a unit membrane leak, so that v relaxes with the membrane time constant τ_v.”</w:t>
+      </w:r>
+    </w:p>
+    <w:p>
       <w:pPr>
         <w:pStyle w:val="Heading2"/>
       </w:pPr>
@@ -336,6 +408,22 @@
           <w:i/>
         </w:rPr>
         <w:t>The reported phase durations are computed per respiratory cycle, over the cycles of a single simulation — there is no trial averaging, because the model is deterministic and contains no noise. We found that the previously reported “±0.05 s” did not represent biological variability but was an artifact of our automated phase-segmentation. We have recomputed the durations directly from the inspiratory population activity on a per-cycle basis; because the model settles onto a clean limit cycle, the phase durations are constant across cycles. We therefore now report them as deterministic values without an uncertainty (inspiratory duration increased from 0.44 s to 1.30 s and expiratory duration from 2.37 s to 3.71 s under pontine inhibition — essentially the originally reported values, now without the spurious ±), and we state explicitly in the Methods that durations are measured per cycle and are reproducible across cycles.</w:t>
+      </w:r>
+    </w:p>
+    <w:p>
+      <w:r>
+        <w:rPr>
+          <w:b/>
+        </w:rPr>
+        <w:t>Revised text (Results, pontine silencing):</w:t>
+      </w:r>
+    </w:p>
+    <w:p>
+      <w:pPr>
+        <w:ind w:left="360"/>
+      </w:pPr>
+      <w:r>
+        <w:t>“…an increase in inspiratory phase duration (T_i from 0.44 to 1.30 s) and expiratory phase duration (T_e from 2.37 to 3.71 s)… These phase durations are measured per respiratory cycle directly from the inspiratory population activity; because the model is deterministic and settles onto a limit cycle, they are constant across cycles and are therefore reported as single values rather than means.”</w:t>
       </w:r>
     </w:p>
     <w:p>
@@ -423,6 +511,22 @@
       </w:r>
     </w:p>
     <w:p>
+      <w:r>
+        <w:rPr>
+          <w:b/>
+        </w:rPr>
+        <w:t>Revised text (Discussion, Network dynamics and biophysical properties of neurons):</w:t>
+      </w:r>
+    </w:p>
+    <w:p>
+      <w:pPr>
+        <w:ind w:left="360"/>
+      </w:pPr>
+      <w:r>
+        <w:t>“A corollary of this network focus is that the model cannot, by construction, predict the effects of pharmacological or genetic manipulations targeting specific channels or receptors. Doing so would require channel- and receptor-resolved data in identified populations (voltage-clamp dissection of the relevant intrinsic currents, per-population conductance profiling, and dynamic-clamp validation), which would let detailed models predict how targeting specific receptors in specific populations alters the integrated behavior and thereby guide interventions for breathing–swallowing disorders. The network-level model presented here is a deliberately modest but necessary first step toward that goal.”</w:t>
+      </w:r>
+    </w:p>
+    <w:p>
       <w:pPr>
         <w:pStyle w:val="Heading2"/>
       </w:pPr>
@@ -454,6 +558,22 @@
           <w:i/>
         </w:rPr>
         <w:t>We thank the reviewer for pointing us to this work, which we now engage with in the Discussion. Rather than citing it as validation of the respiratory three-phase core (which our model adopts from prior work), we focus on its direct bearing on the connectivity our model itself posits. We note that our connection weights are currently set by hand, constrained only by the requirement that the network reproduce the observed motor patterns, and that the conductance-inference method of Molkov et al. (2025, eLife; 2026, bioRxiv) — which decomposes single-neuron recordings into respiratory cycle-phase-dependent excitatory and inhibitory conductances — offers a route to estimate these weights directly from data and, applied during fictive swallowing, to test the specific breathing–swallowing connections we predict (e.g. the SLN-driven inhibition of inspiratory premotor neurons and the pontine gating of the swallowing circuit). We also acknowledge that these data already qualify one of our simplifications: the postinspiratory inhibition that we collapse into a single pontine glottal-closure population is, in those recordings, distributed across the preBötzinger and Bötzinger complexes. Both references have been added to the bibliography.</w:t>
+      </w:r>
+    </w:p>
+    <w:p>
+      <w:r>
+        <w:rPr>
+          <w:b/>
+        </w:rPr>
+        <w:t>Revised text (Discussion, Network dynamics and biophysical properties of neurons):</w:t>
+      </w:r>
+    </w:p>
+    <w:p>
+      <w:pPr>
+        <w:ind w:left="360"/>
+      </w:pPr>
+      <w:r>
+        <w:t>“The connection weights our model posits are set by hand, constrained only by the requirement that the network reproduce the observed motor patterns and a handful of experimental observations. Recent conductance-inference techniques, which decompose single-neuron recordings in rhythmically active circuits into respiratory cycle-phase-dependent excitatory and inhibitory conductances (Molkov et al. 2025; Molkov et al. 2026), offer a route to estimate these weights directly from data and, applied during fictive swallowing, to test the specific breathing–swallowing connections we predict (e.g. the SLN-driven inhibition of inspiratory premotor neurons or the pontine gating of the swallowing circuit). Such data also qualify one of our simplifications: the postinspiratory inhibition that we collapse into a single pontine glottal-closure population is in fact distributed across the preBötC and Bötzinger complex (Molkov et al. 2025).”</w:t>
       </w:r>
     </w:p>
     <w:sectPr>

</xml_diff>

<commit_message>
Response doc: add verbatim revised text for R1 comments 3 (rewritten Sw-gate paragraph) and 4 (section retitle/wording)
Co-Authored-By: Claude Opus 4.8 (1M context) <noreply@anthropic.com>
</commit_message>
<xml_diff>
--- a/docs/Response_to_Reviewers.docx
+++ b/docs/Response_to_Reviewers.docx
@@ -243,6 +243,30 @@
       </w:r>
     </w:p>
     <w:p>
+      <w:r>
+        <w:rPr>
+          <w:b/>
+        </w:rPr>
+        <w:t>Revised text (Results, pontine-silencing section (former Sec. 2.3) — last paragraph rewritten):</w:t>
+      </w:r>
+    </w:p>
+    <w:p>
+      <w:pPr>
+        <w:ind w:left="360"/>
+      </w:pPr>
+      <w:r>
+        <w:t>“Apart from its effects on respiration, pontine inhibition is known to alter swallowing behavior. To reproduce these experimental observations, we introduced a pontine neuronal population that gates sensory input from the superior laryngeal nerve (SLN) to the swallowing network (‘Sw. gate’ in the pontine compartment; model-sequence figure, panel B). We assume that the ‘Sw. gate’ population is intermingled within the pontine respiratory group. In the model, the ‘Sw. gate’ suppresses activation of the swallowing motor population (Sw1). Consequently, inhibition of the pontine respiratory group also suppresses the ‘Sw. gate’, thereby disinhibiting Sw1 and producing spontaneous swallows near the end of the inspiratory phase.”</w:t>
+      </w:r>
+    </w:p>
+    <w:p>
+      <w:pPr>
+        <w:ind w:left="360"/>
+      </w:pPr>
+      <w:r>
+        <w:t>“Because the model is deterministic and contains no noise, these spontaneous swallows occur consistently after termination of the apneustic phrenic nerve activity. A qualitatively similar pattern — spontaneous swallowing following apneustic activity — has been observed during autoresuscitation in the in situ respiratory network, although the experimental timing is much less regular than in the model.”</w:t>
+      </w:r>
+    </w:p>
+    <w:p>
       <w:pPr>
         <w:pStyle w:val="Heading2"/>
       </w:pPr>
@@ -274,6 +298,30 @@
           <w:i/>
         </w:rPr>
         <w:t>The reviewer is right to ask for the distinction. In our computational model, complete silencing of the pons by inhibition and by ablation are indistinguishable (both set the pontine populations and their descending drive to zero). Throughout the text we therefore use “inhibition of the pons,” to remain consistent with the referenced experimental data.</w:t>
+      </w:r>
+    </w:p>
+    <w:p>
+      <w:r>
+        <w:rPr>
+          <w:b/>
+        </w:rPr>
+        <w:t>Revised text (Results, pontine-silencing section — title and opening sentence):</w:t>
+      </w:r>
+    </w:p>
+    <w:p>
+      <w:pPr>
+        <w:ind w:left="360"/>
+      </w:pPr>
+      <w:r>
+        <w:t>“Section title (was “Model validation: deletion of the ponto-medullary synaptic interactions”): “Model validation: silencing of pontine neuronal populations.””</w:t>
+      </w:r>
+    </w:p>
+    <w:p>
+      <w:pPr>
+        <w:ind w:left="360"/>
+      </w:pPr>
+      <w:r>
+        <w:t>“To test whether the proposed ponto-medullary connectivity captures known physiological dependencies, we simulated inhibition of the pontine compartment (the earlier wording “inhibition/lesion” has been replaced by “inhibition”/“silencing” throughout, consistent with the response above).”</w:t>
       </w:r>
     </w:p>
     <w:p>

</xml_diff>

<commit_message>
Response doc: drop the bogus pseudo-quote under R1 comment 1 (structural reorder has no verbatim passage; described in reply prose instead)
Co-Authored-By: Claude Opus 4.8 (1M context) <noreply@anthropic.com>
</commit_message>
<xml_diff>
--- a/docs/Response_to_Reviewers.docx
+++ b/docs/Response_to_Reviewers.docx
@@ -132,22 +132,6 @@
           <w:i/>
         </w:rPr>
         <w:t>We have reordered the manuscript so that the Methods section now directly follows the Introduction.</w:t>
-      </w:r>
-    </w:p>
-    <w:p>
-      <w:r>
-        <w:rPr>
-          <w:b/>
-        </w:rPr>
-        <w:t>Revised text (Methods, new structure):</w:t>
-      </w:r>
-    </w:p>
-    <w:p>
-      <w:pPr>
-        <w:ind w:left="360"/>
-      </w:pPr>
-      <w:r>
-        <w:t>“The manuscript now follows the order Introduction → Methods → Results → Discussion, with the Methods section (Model parameters; Sequential development of the model connectivity, Models 1–4; Modeling of a single swallow) placed directly after the Introduction so that the building blocks are introduced before the simulations that use them.”</w:t>
       </w:r>
     </w:p>
     <w:p>

</xml_diff>

<commit_message>
Response doc: purge non-verbatim commentary from R1 comment 4 & 5 quote blocks
The 'Revised text' blocks for comments 4 (inhibition/lesion note) and 5
('...dimensionless', 'stated with units in the Methods') contained reply
commentary, not manuscript text. Reduced both to pure verbatim quotes (the
commentary already appears in the reply prose). Audited all remaining blocks:
every quoted fragment matches the manuscript exactly.

Co-Authored-By: Claude Opus 4.8 (1M context) <noreply@anthropic.com>
</commit_message>
<xml_diff>
--- a/docs/Response_to_Reviewers.docx
+++ b/docs/Response_to_Reviewers.docx
@@ -289,7 +289,7 @@
         <w:rPr>
           <w:b/>
         </w:rPr>
-        <w:t>Revised text (Results, pontine-silencing section — title and opening sentence):</w:t>
+        <w:t>Revised text (Results — section retitled (was “Model validation: deletion of the ponto-medullary synaptic interactions”) and opening reworded):</w:t>
       </w:r>
     </w:p>
     <w:p>
@@ -297,7 +297,7 @@
         <w:ind w:left="360"/>
       </w:pPr>
       <w:r>
-        <w:t>“Section title (was “Model validation: deletion of the ponto-medullary synaptic interactions”): “Model validation: silencing of pontine neuronal populations.””</w:t>
+        <w:t>“Model validation: silencing of pontine neuronal populations.”</w:t>
       </w:r>
     </w:p>
     <w:p>
@@ -305,7 +305,7 @@
         <w:ind w:left="360"/>
       </w:pPr>
       <w:r>
-        <w:t>“To test whether the proposed ponto-medullary connectivity captures known physiological dependencies, we simulated inhibition of the pontine compartment (the earlier wording “inhibition/lesion” has been replaced by “inhibition”/“silencing” throughout, consistent with the response above).”</w:t>
+        <w:t>“To test whether the proposed ponto-medullary connectivity captures known physiological dependencies, we simulated inhibition of the pontine compartment.”</w:t>
       </w:r>
     </w:p>
     <w:p>
@@ -347,7 +347,7 @@
         <w:rPr>
           <w:b/>
         </w:rPr>
-        <w:t>Revised text (Table 3 and Methods):</w:t>
+        <w:t>Revised text (Table 3 (Intrinsic parameters)):</w:t>
       </w:r>
     </w:p>
     <w:p>
@@ -355,7 +355,15 @@
         <w:ind w:left="360"/>
       </w:pPr>
       <w:r>
-        <w:t>“Table 3 (Intrinsic parameters) column header: “Population | τ_m (ms)”; caption: “Intrinsic parameters. For all populations: b = 0.2, τ_v = 2 ms, s = 30.” The membrane time constant τ_v = 2 ms is likewise stated with units in the Methods; all remaining quantities (b, s, synaptic weights, drives) are dimensionless.”</w:t>
+        <w:t>“Population | τ_m (ms)”</w:t>
+      </w:r>
+    </w:p>
+    <w:p>
+      <w:pPr>
+        <w:ind w:left="360"/>
+      </w:pPr>
+      <w:r>
+        <w:t>“Intrinsic parameters. For all populations: b = 0.2, τ_v = 2 ms, s = 30.”</w:t>
       </w:r>
     </w:p>
     <w:p>

</xml_diff>

<commit_message>
Response doc: reword 'singularly perturbed' -> 'decomposable into fast and slow subcomponents', use ASCII << (symbol didn't render); remove Contents/TOC (blank page)
Co-Authored-By: Claude Opus 4.8 (1M context) <noreply@anthropic.com>
</commit_message>
<xml_diff>
--- a/docs/Response_to_Reviewers.docx
+++ b/docs/Response_to_Reviewers.docx
@@ -35,27 +35,6 @@
       </w:r>
       <w:r>
         <w:t>The reviewers' comments are reproduced in regular type; our responses follow in italics.</w:t>
-      </w:r>
-    </w:p>
-    <w:p>
-      <w:pPr>
-        <w:pStyle w:val="Heading1"/>
-      </w:pPr>
-      <w:r>
-        <w:t>Contents</w:t>
-      </w:r>
-    </w:p>
-    <w:p>
-      <w:r>
-        <w:fldChar w:fldCharType="begin"/>
-        <w:instrText xml:space="preserve">TOC \o "1-1" \h \z \u</w:instrText>
-        <w:fldChar w:fldCharType="separate"/>
-        <w:fldChar w:fldCharType="end"/>
-      </w:r>
-    </w:p>
-    <w:p>
-      <w:r>
-        <w:br w:type="page"/>
       </w:r>
     </w:p>
     <w:p>
@@ -339,7 +318,7 @@
         <w:rPr>
           <w:i/>
         </w:rPr>
-        <w:t>We thank the reviewer for this comment. Addressing it led us to revisit the intrinsic parameters, where we identified a dimensional inconsistency in the original specification: the membrane time constant was reported as τ_v = 0.005 while the adaptation constants τ_m are on the order of 10³–10⁴ in the same (millisecond) equation — a spread of ~10⁶ — and the leak coefficient α = 0.01 was effectively a large input gain (≈ 1/α = 100) rather than a leak. We reparametrized the model via an exact, dynamics-preserving change of variables, ṽ = α v (with ṽ the rescaled activity variable), which relocates this gain from α into the firing-rate function. The leak then becomes unity, so we drop α altogether and write the activity equation as τ_v dṽ/dt = −ṽ − m + (drive − b) + input, with firing-rate function f(ṽ) = 1 / (1 + e^(−s ṽ)) of slope s = 30 (replacing the slope λ); the membrane time constant is now directly τ_v. We further set τ_v = 2 ms, a physiologically realistic membrane time constant; because the system is singularly perturbed (τ_v ≪ τ_m), the network responses are insensitive to τ_v throughout this range (we verified that simulated traces are unchanged apart from sub-millisecond timing). We confirmed numerically that the reparametrized model reproduces the firing-rate dynamics of the original to machine precision — the reparametrization itself changes no simulation result or figure conclusion. The parameters now span a far less drastic range, are dimensionally consistent (τ_v = 2 ms, τ_m = 1.5–17.5 s), and are physiologically interpretable. As requested, we added units to the time constants — τ_m (ms) in Table 3 and τ_v (ms) in the Methods — and confirm that all remaining quantities (b, s, synaptic weights, drives) are dimensionless.</w:t>
+        <w:t>We thank the reviewer for this comment. Addressing it led us to revisit the intrinsic parameters, where we identified a dimensional inconsistency in the original specification: the membrane time constant was reported as τ_v = 0.005 while the adaptation constants τ_m are on the order of 10³–10⁴ in the same (millisecond) equation — a spread of ~10⁶ — and the leak coefficient α = 0.01 was effectively a large input gain (≈ 1/α = 100) rather than a leak. We reparametrized the model via an exact, dynamics-preserving change of variables, ṽ = α v (with ṽ the rescaled activity variable), which relocates this gain from α into the firing-rate function. The leak then becomes unity, so we drop α altogether and write the activity equation as τ_v dṽ/dt = −ṽ − m + (drive − b) + input, with firing-rate function f(ṽ) = 1 / (1 + e^(−s ṽ)) of slope s = 30 (replacing the slope λ); the membrane time constant is now directly τ_v. We further set τ_v = 2 ms, a physiologically realistic membrane time constant; because the system is decomposable into fast and slow subcomponents (τ_v &lt;&lt; τ_m), the network responses are insensitive to τ_v throughout this range (we verified that simulated traces are unchanged apart from sub-millisecond timing). We confirmed numerically that the reparametrized model reproduces the firing-rate dynamics of the original to machine precision — the reparametrization itself changes no simulation result or figure conclusion. The parameters now span a far less drastic range, are dimensionally consistent (τ_v = 2 ms, τ_m = 1.5–17.5 s), and are physiologically interpretable. As requested, we added units to the time constants — τ_m (ms) in Table 3 and τ_v (ms) in the Methods — and confirm that all remaining quantities (b, s, synaptic weights, drives) are dimensionless.</w:t>
       </w:r>
     </w:p>
     <w:p>

</xml_diff>

<commit_message>
Add transcriptomic (gene/receptor-expression) data to the biophysics-data list (R2); keep manuscript + response quote in sync
Co-Authored-By: Claude Opus 4.8 (1M context) <noreply@anthropic.com>
</commit_message>
<xml_diff>
--- a/docs/Response_to_Reviewers.docx
+++ b/docs/Response_to_Reviewers.docx
@@ -526,7 +526,7 @@
         <w:rPr>
           <w:i/>
         </w:rPr>
-        <w:t>We agree and have added a paragraph to the Discussion (section "Network dynamics and biophysical properties of neurons") making this explicit. We now state that, by construction, a connectivity-level model cannot predict the effects of manipulations that act on specific ion channels or receptors — indeed, the same degeneracy that justifies omitting intrinsic conductances (similar firing patterns from diverse channel compositions) implies that the response to an agonist or antagonist cannot be inferred from connectivity alone. We outline the data that would be required to advance toward models capable of predicting such manipulations: channel- and receptor-resolved recordings in identified populations (voltage-clamp dissection of the relevant intrinsic currents, per-population synaptic-conductance profiling, and dynamic-clamp validation of the predicted conductance combinations). We note that such models would allow prediction of how targeting specific receptors in specific populations alters the integrated breathing–swallowing behavior, and thus could guide pharmacological interventions, and we frame the present network-level model as a deliberately modest but necessary first step toward that goal.</w:t>
+        <w:t>We agree and have added a paragraph to the Discussion (section "Network dynamics and biophysical properties of neurons") making this explicit. We now state that, by construction, a connectivity-level model cannot predict the effects of manipulations that act on specific ion channels or receptors — indeed, the same degeneracy that justifies omitting intrinsic conductances (similar firing patterns from diverse channel compositions) implies that the response to an agonist or antagonist cannot be inferred from connectivity alone. We outline the data that would be required to advance toward models capable of predicting such manipulations: channel- and receptor-resolved recordings in identified populations (transcriptomic profiling of ion-channel and receptor expression, voltage-clamp dissection of the relevant intrinsic currents, per-population synaptic-conductance profiling, and dynamic-clamp validation of the predicted conductance combinations). We note that such models would allow prediction of how targeting specific receptors in specific populations alters the integrated breathing–swallowing behavior, and thus could guide pharmacological interventions, and we frame the present network-level model as a deliberately modest but necessary first step toward that goal.</w:t>
       </w:r>
     </w:p>
     <w:p>
@@ -542,7 +542,7 @@
         <w:ind w:left="360"/>
       </w:pPr>
       <w:r>
-        <w:t>“A corollary of this network focus is that the model cannot, by construction, predict the effects of pharmacological or genetic manipulations targeting specific channels or receptors. Doing so would require channel- and receptor-resolved data in identified populations (voltage-clamp dissection of the relevant intrinsic currents, per-population conductance profiling, and dynamic-clamp validation), which would let detailed models predict how targeting specific receptors in specific populations alters the integrated behavior and thereby guide interventions for breathing–swallowing disorders. The network-level model presented here is a deliberately modest but necessary first step toward that goal.”</w:t>
+        <w:t>“A corollary of this network focus is that the model cannot, by construction, predict the effects of pharmacological or genetic manipulations targeting specific channels or receptors. Doing so would require channel- and receptor-resolved data in identified populations (transcriptomic profiling of ion-channel and receptor expression, voltage-clamp dissection of the relevant intrinsic currents, per-population conductance profiling, and dynamic-clamp validation), which would let detailed models predict how targeting specific receptors in specific populations alters the integrated behavior and thereby guide interventions for breathing–swallowing disorders. The network-level model presented here is a deliberately modest but necessary first step toward that goal.”</w:t>
       </w:r>
     </w:p>
     <w:p>

</xml_diff>

<commit_message>
Unify pons terminology to inhibition/silencing (R1-4); trim redundant response replies; add R1-1 building-block pointer
- main.tex: lesion->inhibition, transection->silencing at abstract + Fig 7
  caption (left the unrelated 'transected subdiaphragmatically' prep detail).
- Response doc: shortened the 9 replies that are followed by a verbatim
  'Revised text' block so they no longer re-narrate the quote; R1-1 now points
  to the Sequential-development subsection + Figs 1/2 and notes per-stage
  dynamics are out of scope; R1-4 documents the terminology standardization;
  R1-7 drops the 'essentially the original values' overclaim.

Co-Authored-By: Claude Opus 4.8 (1M context) <noreply@anthropic.com>
</commit_message>
<xml_diff>
--- a/docs/Response_to_Reviewers.docx
+++ b/docs/Response_to_Reviewers.docx
@@ -110,7 +110,7 @@
         <w:rPr>
           <w:i/>
         </w:rPr>
-        <w:t>We have reordered the manuscript so that the Methods section now directly follows the Introduction.</w:t>
+        <w:t>We have moved the Methods to directly follow the Introduction. The stage-by-stage construction of the model (Models 1–4) and the role of each added population are now laid out in the 'Sequential development of the model connectivity' subsection together with the model-sequence figure (Fig. 1), and the dynamics of the initial model in isolation are shown in Fig. 2. A full per-stage dynamical dissection of every elaboration is beyond the scope of this study, but the assembly logic is now explicit.</w:t>
       </w:r>
     </w:p>
     <w:p>
@@ -144,7 +144,7 @@
         <w:rPr>
           <w:i/>
         </w:rPr>
-        <w:t>Yes — the parameters were tuned by hand, and we have clarified both the procedure and the rationale. The intrinsic time constants and tonic drives were adjusted to reproduce the experimentally observed respiratory phase durations and the number of swallows evoked by a 10 s SLN stimulus, while the synaptic weights were built up stage by stage across Models 1–4, each simpler model's connectivity serving as the starting point for the next.</w:t>
+        <w:t>Yes — tuned by hand. We now state this and the procedure explicitly: intrinsic time constants and tonic drives were set to reproduce the observed respiratory phase durations and swallow count, and synaptic weights were built up stage by stage across Models 1–4 (revised text below).</w:t>
       </w:r>
     </w:p>
     <w:p>
@@ -202,7 +202,7 @@
         <w:rPr>
           <w:i/>
         </w:rPr>
-        <w:t>We agree that the paragraph did not reference the figures well enough. We have revised it to make the figure reference explicit and to clarify that it describes the Sw-gate mechanism and the resulting spontaneous-swallow behavior (now referencing the model-sequence figure, panel B, and the apneusis result).</w:t>
+        <w:t>Agreed. We rewrote the paragraph to make the figure reference explicit and to clarify the 'Sw. gate' mechanism behind the spontaneous-swallow behavior (revised text below).</w:t>
       </w:r>
     </w:p>
     <w:p>
@@ -260,7 +260,7 @@
         <w:rPr>
           <w:i/>
         </w:rPr>
-        <w:t>The reviewer is right to ask for the distinction. In our computational model, complete silencing of the pons by inhibition and by ablation are indistinguishable (both set the pontine populations and their descending drive to zero). Throughout the text we therefore use “inhibition of the pons,” to remain consistent with the referenced experimental data.</w:t>
+        <w:t>In the model, silencing the pons by inhibition and by ablation are indistinguishable — both set the pontine populations and their descending drive to zero. We have standardized the wording on 'inhibition'/'silencing' throughout, including the former 'lesion'/'transection' usages, consistent with the referenced experimental data (revised text below).</w:t>
       </w:r>
     </w:p>
     <w:p>
@@ -318,7 +318,7 @@
         <w:rPr>
           <w:i/>
         </w:rPr>
-        <w:t>We thank the reviewer for this comment. Addressing it led us to revisit the intrinsic parameters, where we identified a dimensional inconsistency in the original specification: the membrane time constant was reported as τ_v = 0.005 while the adaptation constants τ_m are on the order of 10³–10⁴ in the same (millisecond) equation — a spread of ~10⁶ — and the leak coefficient α = 0.01 was effectively a large input gain (≈ 1/α = 100) rather than a leak. We reparametrized the model via an exact, dynamics-preserving change of variables, ṽ = α v (with ṽ the rescaled activity variable), which relocates this gain from α into the firing-rate function. The leak then becomes unity, so we drop α altogether and write the activity equation as τ_v dṽ/dt = −ṽ − m + (drive − b) + input, with firing-rate function f(ṽ) = 1 / (1 + e^(−s ṽ)) of slope s = 30 (replacing the slope λ); the membrane time constant is now directly τ_v. We further set τ_v = 2 ms, a physiologically realistic membrane time constant; because the system is decomposable into fast and slow subcomponents (τ_v &lt;&lt; τ_m), the network responses are insensitive to τ_v throughout this range (we verified that simulated traces are unchanged apart from sub-millisecond timing). We confirmed numerically that the reparametrized model reproduces the firing-rate dynamics of the original to machine precision — the reparametrization itself changes no simulation result or figure conclusion. The parameters now span a far less drastic range, are dimensionally consistent (τ_v = 2 ms, τ_m = 1.5–17.5 s), and are physiologically interpretable. As requested, we added units to the time constants — τ_m (ms) in Table 3 and τ_v (ms) in the Methods — and confirm that all remaining quantities (b, s, synaptic weights, drives) are dimensionless.</w:t>
+        <w:t>Addressing this led us to revisit the intrinsic parameters, where we found a dimensional inconsistency: τ_v was reported as 0.005 while the τ_m are of order 10³–10⁴ in the same (ms) equation, and the leak coefficient α = 0.01 acted as a large input gain rather than a leak. We removed α by an exact, dynamics-preserving change of variables (ṽ = α v) that makes the leak unity and moves the gain into the firing-rate slope (s = 30); the membrane time constant is then directly τ_v, which we set to a physiologically realistic 2 ms. Because the system is decomposable into fast and slow subcomponents (τ_v &lt;&lt; τ_m), the responses are insensitive to τ_v over this range, and we verified numerically that the reparametrized model reproduces the original firing-rate dynamics to machine precision — no result or conclusion changes. As requested we added units (τ_m in ms in Table 3, τ_v in ms in the Methods); all other quantities (b, s, weights, drives) are dimensionless (revised text below).</w:t>
       </w:r>
     </w:p>
     <w:p>
@@ -376,7 +376,7 @@
         <w:rPr>
           <w:i/>
         </w:rPr>
-        <w:t>In the original specification α was the decay (leak) coefficient of the activity variable; the reparametrization above normalizes it to unity, so it no longer appears as a free parameter — the −ṽ term is a unit membrane leak (ṽ relaxes with time constant τ_v). The parameter b is a tonic bias offset on the input that sets the population's baseline excitability — an effective firing threshold. We have clarified both in the Methods.</w:t>
+        <w:t>α was the leak coefficient of the activity variable; the reparametrization above normalizes it to unity, so it is no longer a free parameter (the −v term is now a unit membrane leak). b is a tonic bias that sets each population's baseline excitability — an effective firing threshold. Both are now stated in the Methods (revised text below).</w:t>
       </w:r>
     </w:p>
     <w:p>
@@ -426,7 +426,7 @@
         <w:rPr>
           <w:i/>
         </w:rPr>
-        <w:t>The reported phase durations are computed per respiratory cycle, over the cycles of a single simulation — there is no trial averaging, because the model is deterministic and contains no noise. We found that the previously reported “±0.05 s” did not represent biological variability but was an artifact of our automated phase-segmentation. We have recomputed the durations directly from the inspiratory population activity on a per-cycle basis; because the model settles onto a clean limit cycle, the phase durations are constant across cycles. We therefore now report them as deterministic values without an uncertainty (inspiratory duration increased from 0.44 s to 1.30 s and expiratory duration from 2.37 s to 3.71 s under pontine inhibition — essentially the originally reported values, now without the spurious ±), and we state explicitly in the Methods that durations are measured per cycle and are reproducible across cycles.</w:t>
+        <w:t>The durations are computed per respiratory cycle over a single deterministic, noise-free simulation, so there is no trial averaging. The previous '±0.05 s' was an artifact of our automated phase-segmentation, not biological variability; because the model settles onto a clean limit cycle, the per-cycle durations are constant. We therefore now report deterministic values without uncertainty (T_i 0.44→1.30 s, T_e 2.37→3.71 s under pontine inhibition) and state the per-cycle measurement explicitly in the Methods (revised text below).</w:t>
       </w:r>
     </w:p>
     <w:p>
@@ -526,7 +526,7 @@
         <w:rPr>
           <w:i/>
         </w:rPr>
-        <w:t>We agree and have added a paragraph to the Discussion (section "Network dynamics and biophysical properties of neurons") making this explicit. We now state that, by construction, a connectivity-level model cannot predict the effects of manipulations that act on specific ion channels or receptors — indeed, the same degeneracy that justifies omitting intrinsic conductances (similar firing patterns from diverse channel compositions) implies that the response to an agonist or antagonist cannot be inferred from connectivity alone. We outline the data that would be required to advance toward models capable of predicting such manipulations: channel- and receptor-resolved recordings in identified populations (transcriptomic profiling of ion-channel and receptor expression, voltage-clamp dissection of the relevant intrinsic currents, per-population synaptic-conductance profiling, and dynamic-clamp validation of the predicted conductance combinations). We note that such models would allow prediction of how targeting specific receptors in specific populations alters the integrated breathing–swallowing behavior, and thus could guide pharmacological interventions, and we frame the present network-level model as a deliberately modest but necessary first step toward that goal.</w:t>
+        <w:t>We agree and have added a paragraph to the Discussion ('Network dynamics and biophysical properties of neurons'). It states that a connectivity-level model cannot, by construction, predict channel- or receptor-specific manipulations, outlines the data that would be needed to do so (transcriptomic, voltage-clamp, conductance-profiling, and dynamic-clamp), and frames the present model as a modest but necessary first step (revised text below).</w:t>
       </w:r>
     </w:p>
     <w:p>
@@ -576,7 +576,7 @@
         <w:rPr>
           <w:i/>
         </w:rPr>
-        <w:t>We thank the reviewer for pointing us to this work, which we now engage with in the Discussion. Rather than citing it as validation of the respiratory three-phase core (which our model adopts from prior work), we focus on its direct bearing on the connectivity our model itself posits. We note that our connection weights are currently set by hand, constrained only by the requirement that the network reproduce the observed motor patterns, and that the conductance-inference method of Molkov et al. (2025, eLife; 2026, bioRxiv) — which decomposes single-neuron recordings into respiratory cycle-phase-dependent excitatory and inhibitory conductances — offers a route to estimate these weights directly from data and, applied during fictive swallowing, to test the specific breathing–swallowing connections we predict (e.g. the SLN-driven inhibition of inspiratory premotor neurons and the pontine gating of the swallowing circuit). We also acknowledge that these data already qualify one of our simplifications: the postinspiratory inhibition that we collapse into a single pontine glottal-closure population is, in those recordings, distributed across the preBötzinger and Bötzinger complexes. Both references have been added to the bibliography.</w:t>
+        <w:t>We now engage this work in the Discussion. Rather than treating it as validation of the inherited three-phase core, we note that our connection weights are hand-set and that this conductance-inference method offers a route to estimate them from data and to test our predicted breathing–swallowing connections; we also concede that it qualifies one of our simplifications (the single pontine post-inspiratory population). Both references have been added (revised text below).</w:t>
       </w:r>
     </w:p>
     <w:p>

</xml_diff>

<commit_message>
Fix inaccurate Molkov-2025 claim: postinspiratory population is distributed (preBotC+BotC), not 'inhibition collapsed into a pontine glottal-closure population'
The prior wording contradicted our own model (the pontine glottal-closure
post-I population is excitatory, not inhibitory; Pont.Post-I->VN = +0.75) and
conflated our pontine node with Molkov 2025's medullary (preBotC/BotC) post-I
neurons. Reworded to the supported claim: postinspiratory activity we lump into
single populations is distributed across postinspiratory neurons of preBotC and
BotC (Molkov 2025: n=40 = 25 preBotC + 15 BotC). Updated matching response-doc
quote + reply parenthetical.

Co-Authored-By: Claude Opus 4.8 (1M context) <noreply@anthropic.com>
</commit_message>
<xml_diff>
--- a/docs/Response_to_Reviewers.docx
+++ b/docs/Response_to_Reviewers.docx
@@ -576,7 +576,7 @@
         <w:rPr>
           <w:i/>
         </w:rPr>
-        <w:t>We now engage this work in the Discussion. Rather than treating it as validation of the inherited three-phase core, we note that our connection weights are hand-set and that this conductance-inference method offers a route to estimate them from data and to test our predicted breathing–swallowing connections; we also concede that it qualifies one of our simplifications (the single pontine post-inspiratory population). Both references have been added (revised text below).</w:t>
+        <w:t>We now engage this work in the Discussion. Rather than treating it as validation of the inherited three-phase core, we note that our connection weights are hand-set and that this conductance-inference method offers a route to estimate them from data and to test our predicted breathing–swallowing connections; we also concede that it qualifies one of our simplifications (our single-node representation of postinspiratory activity, which is in fact distributed across the preBötC and Bötzinger complex). Both references have been added (revised text below).</w:t>
       </w:r>
     </w:p>
     <w:p>
@@ -592,7 +592,7 @@
         <w:ind w:left="360"/>
       </w:pPr>
       <w:r>
-        <w:t>“The connection weights our model posits are set by hand, constrained only by the requirement that the network reproduce the observed motor patterns and a handful of experimental observations. Recent conductance-inference techniques, which decompose single-neuron recordings in rhythmically active circuits into respiratory cycle-phase-dependent excitatory and inhibitory conductances (Molkov et al. 2025; Molkov et al. 2026), offer a route to estimate these weights directly from data and, applied during fictive swallowing, to test the specific breathing–swallowing connections we predict (e.g. the SLN-driven inhibition of inspiratory premotor neurons or the pontine gating of the swallowing circuit). Such data also qualify one of our simplifications: the postinspiratory inhibition that we collapse into a single pontine glottal-closure population is in fact distributed across the preBötC and Bötzinger complex (Molkov et al. 2025).”</w:t>
+        <w:t>“The connection weights our model posits are set by hand, constrained only by the requirement that the network reproduce the observed motor patterns and a handful of experimental observations. Recent conductance-inference techniques, which decompose single-neuron recordings in rhythmically active circuits into respiratory cycle-phase-dependent excitatory and inhibitory conductances (Molkov et al. 2025; Molkov et al. 2026), offer a route to estimate these weights directly from data and, applied during fictive swallowing, to test the specific breathing–swallowing connections we predict (e.g. the SLN-driven inhibition of inspiratory premotor neurons or the pontine gating of the swallowing circuit). Such data also qualify one of our simplifications: the postinspiratory activity that we lump into single populations is, in the intact network, distributed across postinspiratory neurons of both the preBötC and the Bötzinger complex (Molkov et al. 2025).”</w:t>
       </w:r>
     </w:p>
     <w:sectPr>

</xml_diff>

<commit_message>
Fix post-I simplification claim: model has TWO post-I populations (Botzinger + pons); Molkov 2025 constraint is the missing preBotC post-I
Prior wording ('lump into single populations') wrongly implied one post-I
population. Reworded to state the model's two postinspiratory populations
(Botzinger + pontine) and the actual constraint from Molkov 2025: post-I
neurons (incl. inhibitory) are also present in the preBotC, which the model
omits. Manuscript + response-doc quote/reply updated in sync.

Co-Authored-By: Claude Opus 4.8 (1M context) <noreply@anthropic.com>
</commit_message>
<xml_diff>
--- a/docs/Response_to_Reviewers.docx
+++ b/docs/Response_to_Reviewers.docx
@@ -576,7 +576,7 @@
         <w:rPr>
           <w:i/>
         </w:rPr>
-        <w:t>We now engage this work in the Discussion. Rather than treating it as validation of the inherited three-phase core, we note that our connection weights are hand-set and that this conductance-inference method offers a route to estimate them from data and to test our predicted breathing–swallowing connections; we also concede that it qualifies one of our simplifications (our single-node representation of postinspiratory activity, which is in fact distributed across the preBötC and Bötzinger complex). Both references have been added (revised text below).</w:t>
+        <w:t>We now engage this work in the Discussion. Rather than treating it as validation of the inherited three-phase core, we note that our connection weights are hand-set and that this conductance-inference method offers a route to estimate them from data and to test our predicted breathing–swallowing connections; we also concede that it qualifies one of our simplifications (our model has Bötzinger and pontine postinspiratory populations but no separate preBötC one). Both references have been added (revised text below).</w:t>
       </w:r>
     </w:p>
     <w:p>
@@ -592,7 +592,7 @@
         <w:ind w:left="360"/>
       </w:pPr>
       <w:r>
-        <w:t>“The connection weights our model posits are set by hand, constrained only by the requirement that the network reproduce the observed motor patterns and a handful of experimental observations. Recent conductance-inference techniques, which decompose single-neuron recordings in rhythmically active circuits into respiratory cycle-phase-dependent excitatory and inhibitory conductances (Molkov et al. 2025; Molkov et al. 2026), offer a route to estimate these weights directly from data and, applied during fictive swallowing, to test the specific breathing–swallowing connections we predict (e.g. the SLN-driven inhibition of inspiratory premotor neurons or the pontine gating of the swallowing circuit). Such data also qualify one of our simplifications: the postinspiratory activity that we lump into single populations is, in the intact network, distributed across postinspiratory neurons of both the preBötC and the Bötzinger complex (Molkov et al. 2025).”</w:t>
+        <w:t>“The connection weights our model posits are set by hand, constrained only by the requirement that the network reproduce the observed motor patterns and a handful of experimental observations. Recent conductance-inference techniques, which decompose single-neuron recordings in rhythmically active circuits into respiratory cycle-phase-dependent excitatory and inhibitory conductances (Molkov et al. 2025; Molkov et al. 2026), offer a route to estimate these weights directly from data and, applied during fictive swallowing, to test the specific breathing–swallowing connections we predict (e.g. the SLN-driven inhibition of inspiratory premotor neurons or the pontine gating of the swallowing circuit). Such data also qualify one of our simplifications: we represent postinspiratory activity with two populations — one in the Bötzinger complex and one in the pons — whereas these recordings show that postinspiratory neurons, including inhibitory subtypes, are also present in the preBötC (Molkov et al. 2025).”</w:t>
       </w:r>
     </w:p>
     <w:sectPr>

</xml_diff>

<commit_message>
Reframe Molkov-2025 engagement as a general limitation of concise circuit models
Replace the strained per-population concession with a clean, supported point:
reduced models cannot reflect how neuronal classes distribute across brainstem
compartments — e.g. post-I and aug-E neurons are recorded in both preBotC and
BotC (Molkov 2025: post-I 25/15, aug-E 9/10). Manuscript + response-doc quote
and reply updated in sync.

Co-Authored-By: Claude Opus 4.8 (1M context) <noreply@anthropic.com>
</commit_message>
<xml_diff>
--- a/docs/Response_to_Reviewers.docx
+++ b/docs/Response_to_Reviewers.docx
@@ -576,7 +576,7 @@
         <w:rPr>
           <w:i/>
         </w:rPr>
-        <w:t>We now engage this work in the Discussion. Rather than treating it as validation of the inherited three-phase core, we note that our connection weights are hand-set and that this conductance-inference method offers a route to estimate them from data and to test our predicted breathing–swallowing connections; we also concede that it qualifies one of our simplifications (our model has Bötzinger and pontine postinspiratory populations but no separate preBötC one). Both references have been added (revised text below).</w:t>
+        <w:t>We now engage this work in the Discussion. Rather than treating it as validation of the inherited three-phase core, we note that our connection weights are hand-set and that this conductance-inference method offers a route to estimate them from data and to test our predicted breathing–swallowing connections; it also highlights a limitation of concise circuit models like ours, which cannot capture how distinct neuronal classes are distributed across brainstem compartments. Both references have been added (revised text below).</w:t>
       </w:r>
     </w:p>
     <w:p>
@@ -592,7 +592,7 @@
         <w:ind w:left="360"/>
       </w:pPr>
       <w:r>
-        <w:t>“The connection weights our model posits are set by hand, constrained only by the requirement that the network reproduce the observed motor patterns and a handful of experimental observations. Recent conductance-inference techniques, which decompose single-neuron recordings in rhythmically active circuits into respiratory cycle-phase-dependent excitatory and inhibitory conductances (Molkov et al. 2025; Molkov et al. 2026), offer a route to estimate these weights directly from data and, applied during fictive swallowing, to test the specific breathing–swallowing connections we predict (e.g. the SLN-driven inhibition of inspiratory premotor neurons or the pontine gating of the swallowing circuit). Such data also qualify one of our simplifications: we represent postinspiratory activity with two populations — one in the Bötzinger complex and one in the pons — whereas these recordings show that postinspiratory neurons, including inhibitory subtypes, are also present in the preBötC (Molkov et al. 2025).”</w:t>
+        <w:t>“The connection weights our model posits are set by hand, constrained only by the requirement that the network reproduce the observed motor patterns and a handful of experimental observations. Recent conductance-inference techniques, which decompose single-neuron recordings in rhythmically active circuits into respiratory cycle-phase-dependent excitatory and inhibitory conductances (Molkov et al. 2025; Molkov et al. 2026), offer a route to estimate these weights directly from data and, applied during fictive swallowing, to test the specific breathing–swallowing connections we predict (e.g. the SLN-driven inhibition of inspiratory premotor neurons or the pontine gating of the swallowing circuit). A further limitation of concise circuit models of this kind is that they cannot faithfully reflect how distinct neuronal classes are distributed across brainstem compartments: the same electrophysiological phenotype is often present in more than one compartment — for instance, postinspiratory and augmenting-expiratory neurons are recorded in both the preBötC and the Bötzinger complex (Molkov et al. 2025) — a distribution that a reduced model assigning a single population per phenotype cannot capture.”</w:t>
       </w:r>
     </w:p>
     <w:sectPr>

</xml_diff>

<commit_message>
Apply local Discussion edits: reorder the two paragraphs (biophysics first, connectome second) and remove the 'further limitation' sentence; sync response-doc R2 quote + reply
Co-Authored-By: Claude Opus 4.8 (1M context) <noreply@anthropic.com>
</commit_message>
<xml_diff>
--- a/docs/Response_to_Reviewers.docx
+++ b/docs/Response_to_Reviewers.docx
@@ -576,7 +576,7 @@
         <w:rPr>
           <w:i/>
         </w:rPr>
-        <w:t>We now engage this work in the Discussion. Rather than treating it as validation of the inherited three-phase core, we note that our connection weights are hand-set and that this conductance-inference method offers a route to estimate them from data and to test our predicted breathing–swallowing connections; it also highlights a limitation of concise circuit models like ours, which cannot capture how distinct neuronal classes are distributed across brainstem compartments. Both references have been added (revised text below).</w:t>
+        <w:t>We now engage this work in the Discussion. Rather than treating it as validation of the inherited three-phase core, we note that our connection weights are hand-set and that this conductance-inference method offers a route to estimate them from data and to test our predicted breathing–swallowing connections. Both references have been added (revised text below).</w:t>
       </w:r>
     </w:p>
     <w:p>
@@ -592,7 +592,7 @@
         <w:ind w:left="360"/>
       </w:pPr>
       <w:r>
-        <w:t>“The connection weights our model posits are set by hand, constrained only by the requirement that the network reproduce the observed motor patterns and a handful of experimental observations. Recent conductance-inference techniques, which decompose single-neuron recordings in rhythmically active circuits into respiratory cycle-phase-dependent excitatory and inhibitory conductances (Molkov et al. 2025; Molkov et al. 2026), offer a route to estimate these weights directly from data and, applied during fictive swallowing, to test the specific breathing–swallowing connections we predict (e.g. the SLN-driven inhibition of inspiratory premotor neurons or the pontine gating of the swallowing circuit). A further limitation of concise circuit models of this kind is that they cannot faithfully reflect how distinct neuronal classes are distributed across brainstem compartments: the same electrophysiological phenotype is often present in more than one compartment — for instance, postinspiratory and augmenting-expiratory neurons are recorded in both the preBötC and the Bötzinger complex (Molkov et al. 2025) — a distribution that a reduced model assigning a single population per phenotype cannot capture.”</w:t>
+        <w:t>“The connection weights our model posits are set by hand, constrained only by the requirement that the network reproduce the observed motor patterns and a handful of experimental observations. Recent conductance-inference techniques, which decompose single-neuron recordings in rhythmically active circuits into respiratory cycle-phase-dependent excitatory and inhibitory conductances (Molkov et al. 2025; Molkov et al. 2026), offer a route to estimate these weights directly from data and, applied during fictive swallowing, to test the specific breathing–swallowing connections we predict (e.g. the SLN-driven inhibition of inspiratory premotor neurons or the pontine gating of the swallowing circuit).”</w:t>
       </w:r>
     </w:p>
     <w:sectPr>

</xml_diff>

<commit_message>
Bridge the two Discussion paragraphs: add a transition framing network-only challenges (incomplete connectivity data + Molkov cell-type distribution) and relink the connectome paragraph as 'a further challenge'; fold in Overleaf trailing-backslash removal; sync response doc
Co-Authored-By: Claude Opus 4.8 (1M context) <noreply@anthropic.com>
</commit_message>
<xml_diff>
--- a/docs/Response_to_Reviewers.docx
+++ b/docs/Response_to_Reviewers.docx
@@ -576,7 +576,7 @@
         <w:rPr>
           <w:i/>
         </w:rPr>
-        <w:t>We now engage this work in the Discussion. Rather than treating it as validation of the inherited three-phase core, we note that our connection weights are hand-set and that this conductance-inference method offers a route to estimate them from data and to test our predicted breathing–swallowing connections. Both references have been added (revised text below).</w:t>
+        <w:t>We now engage this work in the Discussion. Rather than treating it as validation of the inherited three-phase core, we note two ways it bears on our model: the cell-type distribution it reports is not fully captured by our reduced circuit, and its conductance-inference method offers a route to estimate our hand-set connection weights from data and to test our predicted breathing–swallowing connections. Both references have been added (revised text below).</w:t>
       </w:r>
     </w:p>
     <w:p>
@@ -592,7 +592,15 @@
         <w:ind w:left="360"/>
       </w:pPr>
       <w:r>
-        <w:t>“The connection weights our model posits are set by hand, constrained only by the requirement that the network reproduce the observed motor patterns and a handful of experimental observations. Recent conductance-inference techniques, which decompose single-neuron recordings in rhythmically active circuits into respiratory cycle-phase-dependent excitatory and inhibitory conductances (Molkov et al. 2025; Molkov et al. 2026), offer a route to estimate these weights directly from data and, applied during fictive swallowing, to test the specific breathing–swallowing connections we predict (e.g. the SLN-driven inhibition of inspiratory premotor neurons or the pontine gating of the swallowing circuit).”</w:t>
+        <w:t>“However, even when attention is restricted to network connectivity, substantial challenges remain. The available experimental data on connectivity are incomplete, and the distribution of neuronal cell types across compartments — for instance, as reported by Molkov et al. (2025) — is not well captured by a reduced circuit of the present kind.”</w:t>
+      </w:r>
+    </w:p>
+    <w:p>
+      <w:pPr>
+        <w:ind w:left="360"/>
+      </w:pPr>
+      <w:r>
+        <w:t>“A further challenge is that the connection weights our model posits are set by hand, constrained only by the requirement that the network reproduce the observed motor patterns and a handful of experimental observations. Recent conductance-inference techniques, which decompose single-neuron recordings in rhythmically active circuits into respiratory cycle-phase-dependent excitatory and inhibitory conductances (Molkov et al. 2025; Molkov et al. 2026), offer a route to estimate these weights directly from data and, applied during fictive swallowing, to test the specific breathing–swallowing connections we predict (e.g. the SLN-driven inhibition of inspiratory premotor neurons or the pontine gating of the swallowing circuit).”</w:t>
       </w:r>
     </w:p>
     <w:sectPr>

</xml_diff>

<commit_message>
Reframe weight challenge as underconstrained parameter space (not 'set by hand', which is incidental); adopt Overleaf paragraph merge; sync response doc
Co-Authored-By: Claude Opus 4.8 (1M context) <noreply@anthropic.com>
</commit_message>
<xml_diff>
--- a/docs/Response_to_Reviewers.docx
+++ b/docs/Response_to_Reviewers.docx
@@ -576,7 +576,7 @@
         <w:rPr>
           <w:i/>
         </w:rPr>
-        <w:t>We now engage this work in the Discussion. Rather than treating it as validation of the inherited three-phase core, we note two ways it bears on our model: the cell-type distribution it reports is not fully captured by our reduced circuit, and its conductance-inference method offers a route to estimate our hand-set connection weights from data and to test our predicted breathing–swallowing connections. Both references have been added (revised text below).</w:t>
+        <w:t>We now engage this work in the Discussion. Rather than treating it as validation of the inherited three-phase core, we note two ways it bears on our model: the cell-type distribution it reports is not fully captured by our reduced circuit, and its conductance-inference method offers a route to estimate these underconstrained connection weights from data and to test our predicted breathing–swallowing connections. Both references have been added (revised text below).</w:t>
       </w:r>
     </w:p>
     <w:p>
@@ -600,7 +600,7 @@
         <w:ind w:left="360"/>
       </w:pPr>
       <w:r>
-        <w:t>“A further challenge is that the connection weights our model posits are set by hand, constrained only by the requirement that the network reproduce the observed motor patterns and a handful of experimental observations. Recent conductance-inference techniques, which decompose single-neuron recordings in rhythmically active circuits into respiratory cycle-phase-dependent excitatory and inhibitory conductances (Molkov et al. 2025; Molkov et al. 2026), offer a route to estimate these weights directly from data and, applied during fictive swallowing, to test the specific breathing–swallowing connections we predict (e.g. the SLN-driven inhibition of inspiratory premotor neurons or the pontine gating of the swallowing circuit).”</w:t>
+        <w:t>“A further challenge is that the connection weights our model posits are underconstrained: reproducing the observed motor patterns and a handful of experimental observations does not uniquely determine them. Recent conductance-inference techniques, which decompose single-neuron recordings in rhythmically active circuits into respiratory cycle-phase-dependent excitatory and inhibitory conductances (Molkov et al. 2025; Molkov et al. 2026), offer a route to estimate these weights directly from data and, applied during fictive swallowing, to test the specific breathing–swallowing connections we predict (e.g. the SLN-driven inhibition of inspiratory premotor neurons or the pontine gating of the swallowing circuit).”</w:t>
       </w:r>
     </w:p>
     <w:sectPr>

</xml_diff>